<commit_message>
Refactor Jobright scraping functionality to support Recommend feed, enhance job data extraction, and improve UI elements for a more cohesive user experience.
</commit_message>
<xml_diff>
--- a/json2docx/resume_template/Grant/cover-letter.docx
+++ b/json2docx/resume_template/Grant/cover-letter.docx
@@ -109,16 +109,6 @@
           <w:szCs w:val="24"/>
         </w:rPr>
         <w:t>+1 727 474 0990</w:t>
-      </w:r>
-      <w:r>
-        <w:rPr>
-          <w:rFonts w:ascii="Aptos" w:hAnsi="Aptos" w:cstheme="minorHAnsi"/>
-          <w:b/>
-          <w:bCs/>
-          <w:sz w:val="24"/>
-          <w:szCs w:val="24"/>
-        </w:rPr>
-        <w:t xml:space="preserve"> | US Citizen</w:t>
       </w:r>
       <w:r>
         <w:t>‬</w:t>

</xml_diff>